<commit_message>
User guide: target Visual Studio 2026
Co-authored-by: Copilot App <223556219+Copilot@users.noreply.github.com>
</commit_message>
<xml_diff>
--- a/Documents/GitHub_Copilot_Visual_Studio_UserGuide.docx
+++ b/Documents/GitHub_Copilot_Visual_Studio_UserGuide.docx
@@ -21,6 +21,11 @@
       </w:pPr>
       <w:r>
         <w:t>1. Overview</w:t>
+      </w:r>
+    </w:p>
+    <w:p>
+      <w:r>
+        <w:t>Written for Visual Studio 2026. Menu names and icon placement can differ slightly between updates.</w:t>
       </w:r>
     </w:p>
     <w:p>
@@ -245,7 +250,7 @@
         <w:pStyle w:val="ListBullet"/>
       </w:pPr>
       <w:r>
-        <w:t>Visual Studio with the Desktop development with C++ workload and the C++ MFC component (the project uses platform toolset v145). Use a Visual Studio version that includes GitHub Copilot (Visual Studio 2022 17.8 or later, or newer).</w:t>
+        <w:t>Visual Studio with the Desktop development with C++ workload and the C++ MFC component (the project uses platform toolset v145). Visual Studio 2026, which includes GitHub Copilot as a built-in feature (install the GitHub Copilot component through the Visual Studio Installer if it is missing).</w:t>
       </w:r>
     </w:p>
     <w:p>

</xml_diff>

<commit_message>
User guide: Copilot is opened via View > GitHub Copilot
Co-authored-by: Copilot App <223556219+Copilot@users.noreply.github.com>
</commit_message>
<xml_diff>
--- a/Documents/GitHub_Copilot_Visual_Studio_UserGuide.docx
+++ b/Documents/GitHub_Copilot_Visual_Studio_UserGuide.docx
@@ -306,7 +306,7 @@
         <w:pStyle w:val="ListNumber"/>
       </w:pPr>
       <w:r>
-        <w:t>Check that Copilot is active: the GitHub Copilot badge in the top right corner (or the status bar) should show it is enabled. If not, use it to sign in and enable Copilot.</w:t>
+        <w:t>Check that Copilot is active: open View &gt; GitHub Copilot. If it asks you to sign in, sign in with the same GitHub account and enable Copilot.</w:t>
       </w:r>
     </w:p>
     <w:p>
@@ -586,7 +586,7 @@
     </w:p>
     <w:p>
       <w:r>
-        <w:t>Open it with View &gt; GitHub Copilot Chat. Useful requests for this project:</w:t>
+        <w:t>Open it with View &gt; GitHub Copilot. Useful requests for this project:</w:t>
       </w:r>
     </w:p>
     <w:p>

</xml_diff>

<commit_message>
User guide: menu is View > GitHub Copilot Chat
Co-authored-by: Copilot App <223556219+Copilot@users.noreply.github.com>
</commit_message>
<xml_diff>
--- a/Documents/GitHub_Copilot_Visual_Studio_UserGuide.docx
+++ b/Documents/GitHub_Copilot_Visual_Studio_UserGuide.docx
@@ -306,7 +306,7 @@
         <w:pStyle w:val="ListNumber"/>
       </w:pPr>
       <w:r>
-        <w:t>Check that Copilot is active: open View &gt; GitHub Copilot. If it asks you to sign in, sign in with the same GitHub account and enable Copilot.</w:t>
+        <w:t>Check that Copilot is active: open View &gt; GitHub Copilot Chat. If it asks you to sign in, sign in with the same GitHub account and enable Copilot.</w:t>
       </w:r>
     </w:p>
     <w:p>
@@ -586,7 +586,7 @@
     </w:p>
     <w:p>
       <w:r>
-        <w:t>Open it with View &gt; GitHub Copilot. Useful requests for this project:</w:t>
+        <w:t>Open it with View &gt; GitHub Copilot Chat. Useful requests for this project:</w:t>
       </w:r>
     </w:p>
     <w:p>

</xml_diff>